<commit_message>
Fix affiliation 3: Universidad Bernardo O'Higgins, Santiago, Chile
Corrected in main.tex, main.pdf and .docx (all three outputs).

Co-Authored-By: Claude Sonnet 4.6 <noreply@anthropic.com>
</commit_message>
<xml_diff>
--- a/Smarandache_LeyvaVazquez_2026_TypeK_NS_v01.docx
+++ b/Smarandache_LeyvaVazquez_2026_TypeK_NS_v01.docx
@@ -44,7 +44,13 @@
         </w:rPr>
         <w:t>¹ Department of Mathematics, University of New Mexico, Gallup, NM 87301, USA. smarand@unm.edu</w:t>
         <w:br/>
-        <w:t>² Facultad de Ciencias Matemáticas, Universidad de Guayaquil, Ecuador. maikel.leyvavazquez@ug.edu.ec</w:t>
+        <w:t>² Facultad de Ciencias Matemáticas y Físicas, Universidad de Guayaquil, Ecuador.</w:t>
+        <w:br/>
+        <w:t>³ Universidad Bolivariana del Ecuador, Durán, Ecuador.</w:t>
+        <w:br/>
+        <w:t>⁴ Universidad Bernardo O'Higgins, Santiago, Chile.</w:t>
+        <w:br/>
+        <w:t>maikel.leyvavazquez@ug.edu.ec</w:t>
       </w:r>
     </w:p>
     <w:p>

</xml_diff>